<commit_message>
Quite sistema de pago
</commit_message>
<xml_diff>
--- a/Fase 1/Evidencias Grupales/1.5_GuiaEstudiante_Fase 1_Definicion Proyecto APT (Español).docx
+++ b/Fase 1/Evidencias Grupales/1.5_GuiaEstudiante_Fase 1_Definicion Proyecto APT (Español).docx
@@ -1103,7 +1103,19 @@
               <w:rPr>
                 <w:iCs/>
               </w:rPr>
-              <w:t>o jardinería, pero no cuentan con una plataforma confiable para encontrar profesionales en su zona. A la vez, muchos trabajadores independientes</w:t>
+              <w:t xml:space="preserve">o jardinería, pero no cuentan con una plataforma confiable para encontrar </w:t>
+            </w:r>
+            <w:r>
+              <w:rPr>
+                <w:iCs/>
+              </w:rPr>
+              <w:t>trabajadores</w:t>
+            </w:r>
+            <w:r>
+              <w:rPr>
+                <w:iCs/>
+              </w:rPr>
+              <w:t xml:space="preserve"> en su zona. A la vez, muchos trabajadores independientes</w:t>
             </w:r>
             <w:r>
               <w:rPr>
@@ -1163,7 +1175,19 @@
               <w:rPr>
                 <w:iCs/>
               </w:rPr>
-              <w:t xml:space="preserve">El proyecto se enfocará inicialmente en </w:t>
+              <w:t xml:space="preserve">El proyecto se enfocará inicialmente </w:t>
+            </w:r>
+            <w:r>
+              <w:rPr>
+                <w:iCs/>
+              </w:rPr>
+              <w:t xml:space="preserve">en la región </w:t>
+            </w:r>
+            <w:r>
+              <w:rPr>
+                <w:iCs/>
+              </w:rPr>
+              <w:t xml:space="preserve">Metropolitana de </w:t>
             </w:r>
             <w:r>
               <w:rPr>
@@ -1260,7 +1284,13 @@
               <w:rPr>
                 <w:iCs/>
               </w:rPr>
-              <w:t>todas las regiones de</w:t>
+              <w:t xml:space="preserve">la región Metropolitana </w:t>
+            </w:r>
+            <w:r>
+              <w:rPr>
+                <w:iCs/>
+              </w:rPr>
+              <w:t>de</w:t>
             </w:r>
             <w:r>
               <w:rPr>
@@ -1290,7 +1320,13 @@
               <w:rPr>
                 <w:iCs/>
               </w:rPr>
-              <w:t xml:space="preserve"> por zona</w:t>
+              <w:t xml:space="preserve"> por </w:t>
+            </w:r>
+            <w:r>
+              <w:rPr>
+                <w:iCs/>
+              </w:rPr>
+              <w:t>comuna</w:t>
             </w:r>
             <w:r>
               <w:rPr>
@@ -1353,7 +1389,19 @@
               <w:rPr>
                 <w:iCs/>
               </w:rPr>
-              <w:t>Actualmente, muchos de estos trabajadores dependen casi exclusivamente de recomendaciones boca a boca o contactos limitados en redes sociales, lo que restringe su alcance y oportunidades. Nuestra propuesta busca digitalizar y profesionalizar esta conexión, ofreciendo un espacio donde puedan crear un perfil, administrar su oferta de servicios y recibir contrataciones de forma directa y segura.</w:t>
+              <w:t xml:space="preserve">Actualmente, muchos de estos trabajadores dependen casi exclusivamente de recomendaciones boca a boca o contactos limitados en redes sociales, lo que restringe su alcance y oportunidades. Nuestra propuesta busca digitalizar y profesionalizar esta conexión, ofreciendo un espacio donde puedan crear un perfil, administrar su oferta de servicios y recibir </w:t>
+            </w:r>
+            <w:r>
+              <w:rPr>
+                <w:iCs/>
+              </w:rPr>
+              <w:t>solicitudes de servicios</w:t>
+            </w:r>
+            <w:r>
+              <w:rPr>
+                <w:iCs/>
+              </w:rPr>
+              <w:t xml:space="preserve"> de forma directa y segura.</w:t>
             </w:r>
           </w:p>
           <w:p>
@@ -1420,7 +1468,19 @@
               <w:rPr>
                 <w:iCs/>
               </w:rPr>
-              <w:t xml:space="preserve"> podrán registrarse en la plataforma y crear su “tarjeta de trabajo” o perfil digital.</w:t>
+              <w:t xml:space="preserve"> podrán registrarse en la plataforma y </w:t>
+            </w:r>
+            <w:r>
+              <w:rPr>
+                <w:iCs/>
+              </w:rPr>
+              <w:t xml:space="preserve">luego </w:t>
+            </w:r>
+            <w:r>
+              <w:rPr>
+                <w:iCs/>
+              </w:rPr>
+              <w:t>crear su tarjeta de trabajo.</w:t>
             </w:r>
           </w:p>
           <w:p>
@@ -1450,68 +1510,55 @@
               <w:rPr>
                 <w:iCs/>
               </w:rPr>
-              <w:t xml:space="preserve"> edad, género,</w:t>
-            </w:r>
-            <w:r>
-              <w:rPr>
-                <w:iCs/>
-              </w:rPr>
-              <w:t xml:space="preserve"> servicios ofrecidos</w:t>
-            </w:r>
-            <w:r>
-              <w:rPr>
-                <w:iCs/>
-              </w:rPr>
-              <w:t xml:space="preserve"> (para trabajadores)</w:t>
-            </w:r>
-            <w:r>
-              <w:rPr>
-                <w:iCs/>
-              </w:rPr>
-              <w:t xml:space="preserve">, </w:t>
-            </w:r>
-            <w:r>
-              <w:rPr>
-                <w:iCs/>
-              </w:rPr>
-              <w:t>dirección</w:t>
-            </w:r>
-            <w:r>
-              <w:rPr>
-                <w:iCs/>
-              </w:rPr>
-              <w:t xml:space="preserve">, </w:t>
-            </w:r>
-            <w:r>
-              <w:rPr>
-                <w:iCs/>
-              </w:rPr>
-              <w:t xml:space="preserve">foto de </w:t>
-            </w:r>
-            <w:r>
-              <w:rPr>
-                <w:iCs/>
-              </w:rPr>
-              <w:lastRenderedPageBreak/>
-              <w:t>perfil</w:t>
-            </w:r>
-            <w:r>
-              <w:rPr>
-                <w:iCs/>
-              </w:rPr>
-              <w:t>, certificaciones</w:t>
-            </w:r>
-            <w:r>
-              <w:rPr>
-                <w:iCs/>
-              </w:rPr>
-              <w:t xml:space="preserve">, </w:t>
+              <w:t xml:space="preserve"> edad,</w:t>
+            </w:r>
+            <w:r>
+              <w:rPr>
+                <w:iCs/>
+              </w:rPr>
+              <w:t xml:space="preserve"> servicios ofrecidos,</w:t>
+            </w:r>
+            <w:r>
+              <w:rPr>
+                <w:iCs/>
+              </w:rPr>
+              <w:t xml:space="preserve"> comuna y región,</w:t>
+            </w:r>
+            <w:r>
+              <w:rPr>
+                <w:iCs/>
+              </w:rPr>
+              <w:t xml:space="preserve"> </w:t>
+            </w:r>
+            <w:r>
+              <w:rPr>
+                <w:iCs/>
+              </w:rPr>
+              <w:t>foto de perfil</w:t>
+            </w:r>
+            <w:r>
+              <w:rPr>
+                <w:iCs/>
+              </w:rPr>
+              <w:t>,</w:t>
+            </w:r>
+            <w:r>
+              <w:rPr>
+                <w:iCs/>
+              </w:rPr>
+              <w:t xml:space="preserve"> </w:t>
             </w:r>
             <w:r>
               <w:rPr>
                 <w:iCs/>
               </w:rPr>
               <w:t>valor por servicio</w:t>
+            </w:r>
+            <w:r>
+              <w:rPr>
+                <w:iCs/>
+              </w:rPr>
+              <w:t>, calificación de estrellas</w:t>
             </w:r>
             <w:r>
               <w:rPr>
@@ -1543,7 +1590,24 @@
                 <w:bCs/>
                 <w:iCs/>
               </w:rPr>
-              <w:t>Búsqueda y contratación por parte de clientes</w:t>
+              <w:lastRenderedPageBreak/>
+              <w:t xml:space="preserve">Búsqueda y </w:t>
+            </w:r>
+            <w:r>
+              <w:rPr>
+                <w:b/>
+                <w:bCs/>
+                <w:iCs/>
+              </w:rPr>
+              <w:t>solicitud</w:t>
+            </w:r>
+            <w:r>
+              <w:rPr>
+                <w:b/>
+                <w:bCs/>
+                <w:iCs/>
+              </w:rPr>
+              <w:t xml:space="preserve"> por parte de clientes</w:t>
             </w:r>
           </w:p>
           <w:p>
@@ -1561,13 +1625,31 @@
               <w:rPr>
                 <w:iCs/>
               </w:rPr>
-              <w:t>Los clientes podrán buscar profesionales filtrando por servicio, ubicación</w:t>
-            </w:r>
-            <w:r>
-              <w:rPr>
-                <w:iCs/>
-              </w:rPr>
-              <w:t>, género y edad</w:t>
+              <w:t xml:space="preserve">Los clientes podrán buscar </w:t>
+            </w:r>
+            <w:r>
+              <w:rPr>
+                <w:iCs/>
+              </w:rPr>
+              <w:t>trabajadores</w:t>
+            </w:r>
+            <w:r>
+              <w:rPr>
+                <w:iCs/>
+              </w:rPr>
+              <w:t xml:space="preserve"> filtrando por servicio, ubicación</w:t>
+            </w:r>
+            <w:r>
+              <w:rPr>
+                <w:iCs/>
+              </w:rPr>
+              <w:t xml:space="preserve"> </w:t>
+            </w:r>
+            <w:r>
+              <w:rPr>
+                <w:iCs/>
+              </w:rPr>
+              <w:t>y edad</w:t>
             </w:r>
             <w:r>
               <w:rPr>
@@ -1595,16 +1677,12 @@
             </w:r>
             <w:r>
               <w:rPr>
-                <w:b/>
-                <w:bCs/>
                 <w:iCs/>
               </w:rPr>
               <w:t>reservar</w:t>
             </w:r>
             <w:r>
               <w:rPr>
-                <w:b/>
-                <w:bCs/>
                 <w:iCs/>
               </w:rPr>
               <w:t xml:space="preserve"> una fecha</w:t>
@@ -1613,21 +1691,19 @@
               <w:rPr>
                 <w:iCs/>
               </w:rPr>
-              <w:t xml:space="preserve"> y </w:t>
-            </w:r>
-            <w:r>
-              <w:rPr>
-                <w:b/>
-                <w:bCs/>
-                <w:iCs/>
-              </w:rPr>
-              <w:t>realizar el pago online</w:t>
-            </w:r>
-            <w:r>
-              <w:rPr>
-                <w:iCs/>
-              </w:rPr>
-              <w:t xml:space="preserve"> para mayor comodidad.</w:t>
+              <w:t xml:space="preserve"> y</w:t>
+            </w:r>
+            <w:r>
+              <w:rPr>
+                <w:iCs/>
+              </w:rPr>
+              <w:t xml:space="preserve"> hora </w:t>
+            </w:r>
+            <w:r>
+              <w:rPr>
+                <w:iCs/>
+              </w:rPr>
+              <w:t>para mayor comodidad.</w:t>
             </w:r>
           </w:p>
           <w:p>
@@ -1781,43 +1857,13 @@
               <w:rPr>
                 <w:iCs/>
               </w:rPr>
-              <w:t xml:space="preserve">En una primera etapa, la plataforma se enfocará en </w:t>
-            </w:r>
-            <w:r>
-              <w:rPr>
-                <w:b/>
-                <w:bCs/>
-                <w:iCs/>
-              </w:rPr>
-              <w:t>limpieza del hogar</w:t>
-            </w:r>
-            <w:r>
-              <w:rPr>
-                <w:iCs/>
-              </w:rPr>
-              <w:t xml:space="preserve">, </w:t>
-            </w:r>
-            <w:r>
-              <w:rPr>
-                <w:b/>
-                <w:bCs/>
-                <w:iCs/>
-              </w:rPr>
-              <w:t>gasfitería</w:t>
-            </w:r>
-            <w:r>
-              <w:rPr>
-                <w:iCs/>
-              </w:rPr>
-              <w:t xml:space="preserve"> y </w:t>
-            </w:r>
-            <w:r>
-              <w:rPr>
-                <w:b/>
-                <w:bCs/>
-                <w:iCs/>
-              </w:rPr>
-              <w:t>jardinería</w:t>
+              <w:t>En una primera etapa, la plataforma se enfocará en limpieza del hogar, gasfitería y jardinería</w:t>
+            </w:r>
+            <w:r>
+              <w:rPr>
+                <w:iCs/>
+              </w:rPr>
+              <w:t>.</w:t>
             </w:r>
           </w:p>
           <w:p>
@@ -1865,13 +1911,43 @@
               <w:rPr>
                 <w:iCs/>
               </w:rPr>
-              <w:t xml:space="preserve">), permitiendo la integración de profesionales </w:t>
+              <w:t xml:space="preserve">), permitiendo la integración de </w:t>
+            </w:r>
+            <w:r>
+              <w:rPr>
+                <w:iCs/>
+              </w:rPr>
+              <w:t>trabajadores</w:t>
+            </w:r>
+            <w:r>
+              <w:rPr>
+                <w:iCs/>
+              </w:rPr>
+              <w:t xml:space="preserve"> </w:t>
             </w:r>
             <w:r>
               <w:rPr>
                 <w:iCs/>
               </w:rPr>
               <w:t>de todo tipo.</w:t>
+            </w:r>
+          </w:p>
+          <w:p>
+            <w:pPr>
+              <w:numPr>
+                <w:ilvl w:val="1"/>
+                <w:numId w:val="17"/>
+              </w:numPr>
+              <w:spacing w:line="240" w:lineRule="auto"/>
+              <w:rPr>
+                <w:iCs/>
+              </w:rPr>
+            </w:pPr>
+            <w:r>
+              <w:rPr>
+                <w:iCs/>
+              </w:rPr>
+              <w:t>Luego del análisis post despliegue se irán agregando más regiones de Chile.</w:t>
             </w:r>
           </w:p>
           <w:p>
@@ -2101,39 +2177,31 @@
               <w:rPr>
                 <w:iCs/>
               </w:rPr>
-              <w:t xml:space="preserve">Con el fin de obtener ganancias en base al proyecto, se cobrará una comisión de un 5% por servicio realizado, el cual puede cambiar con los años </w:t>
-            </w:r>
-            <w:r>
-              <w:rPr>
-                <w:iCs/>
-              </w:rPr>
-              <w:t>respecto a</w:t>
-            </w:r>
-            <w:r>
-              <w:rPr>
-                <w:iCs/>
-              </w:rPr>
-              <w:t xml:space="preserve"> la data que se genere.</w:t>
-            </w:r>
-          </w:p>
-          <w:p>
-            <w:pPr>
-              <w:spacing w:before="240" w:after="240" w:line="240" w:lineRule="auto"/>
-              <w:rPr>
-                <w:iCs/>
-              </w:rPr>
-            </w:pPr>
-            <w:r>
-              <w:rPr>
-                <w:iCs/>
-              </w:rPr>
-              <w:t>Se utilizarán herramientas accesibles como HTML, CSS</w:t>
-            </w:r>
-            <w:r>
-              <w:rPr>
-                <w:iCs/>
-              </w:rPr>
-              <w:t xml:space="preserve">, Python, Microsoft Proyect </w:t>
+              <w:t xml:space="preserve">Se utilizarán herramientas accesibles como </w:t>
+            </w:r>
+            <w:r>
+              <w:rPr>
+                <w:iCs/>
+              </w:rPr>
+              <w:t>Visual Studio Code</w:t>
+            </w:r>
+            <w:r>
+              <w:rPr>
+                <w:iCs/>
+              </w:rPr>
+              <w:t>,</w:t>
+            </w:r>
+            <w:r>
+              <w:rPr>
+                <w:iCs/>
+              </w:rPr>
+              <w:t xml:space="preserve"> Microsoft Office,</w:t>
+            </w:r>
+            <w:r>
+              <w:rPr>
+                <w:iCs/>
+              </w:rPr>
+              <w:t xml:space="preserve"> Microsoft Proyect </w:t>
             </w:r>
             <w:r>
               <w:rPr>
@@ -2151,7 +2219,7 @@
               <w:rPr>
                 <w:iCs/>
               </w:rPr>
-              <w:t xml:space="preserve"> el código y documentación, y</w:t>
+              <w:t xml:space="preserve"> el código y</w:t>
             </w:r>
             <w:r>
               <w:rPr>
@@ -2159,19 +2227,49 @@
               </w:rPr>
               <w:t xml:space="preserve"> </w:t>
             </w:r>
+            <w:r>
+              <w:rPr>
+                <w:iCs/>
+              </w:rPr>
+              <w:t>documentación</w:t>
+            </w:r>
+            <w:r>
+              <w:rPr>
+                <w:iCs/>
+              </w:rPr>
+              <w:t>,</w:t>
+            </w:r>
+            <w:r>
+              <w:rPr>
+                <w:iCs/>
+              </w:rPr>
+              <w:t xml:space="preserve"> </w:t>
+            </w:r>
             <w:proofErr w:type="spellStart"/>
             <w:r>
               <w:rPr>
                 <w:iCs/>
               </w:rPr>
-              <w:t>Firebase</w:t>
+              <w:t>Postgresql</w:t>
             </w:r>
             <w:proofErr w:type="spellEnd"/>
             <w:r>
               <w:rPr>
                 <w:iCs/>
               </w:rPr>
-              <w:t xml:space="preserve"> para base de datos y hosting</w:t>
+              <w:t xml:space="preserve"> para base de datos y</w:t>
+            </w:r>
+            <w:r>
+              <w:rPr>
+                <w:iCs/>
+              </w:rPr>
+              <w:t xml:space="preserve"> Docker para</w:t>
+            </w:r>
+            <w:r>
+              <w:rPr>
+                <w:iCs/>
+              </w:rPr>
+              <w:t xml:space="preserve"> hosting</w:t>
             </w:r>
             <w:r>
               <w:rPr>
@@ -2315,13 +2413,19 @@
               <w:rPr>
                 <w:iCs/>
               </w:rPr>
-              <w:t xml:space="preserve">Falta de experiencia </w:t>
-            </w:r>
-            <w:r>
-              <w:rPr>
-                <w:iCs/>
-              </w:rPr>
-              <w:t>en el desarrollo o implementaciones del código.</w:t>
+              <w:t xml:space="preserve">Falta de </w:t>
+            </w:r>
+            <w:r>
+              <w:rPr>
+                <w:iCs/>
+              </w:rPr>
+              <w:t>tiempo por estimación versus realidad en el desarrollo del software</w:t>
+            </w:r>
+            <w:r>
+              <w:rPr>
+                <w:iCs/>
+              </w:rPr>
+              <w:t>.</w:t>
             </w:r>
           </w:p>
           <w:p>
@@ -2597,26 +2701,61 @@
                 <w:ilvl w:val="0"/>
                 <w:numId w:val="18"/>
               </w:numPr>
-              <w:spacing w:before="240" w:after="240" w:line="240" w:lineRule="auto"/>
-              <w:rPr>
-                <w:iCs/>
-              </w:rPr>
-            </w:pPr>
-            <w:r>
-              <w:rPr>
-                <w:iCs/>
-              </w:rPr>
-              <w:t>Alcanzar un registro de al menos 500 trabajadores independientes en la plataforma durante el primer año de funcionamiento.</w:t>
+              <w:spacing w:after="0"/>
+              <w:rPr>
+                <w:rFonts w:cs="Arial"/>
+                <w:szCs w:val="24"/>
+              </w:rPr>
+            </w:pPr>
+            <w:r>
+              <w:rPr>
+                <w:rFonts w:cs="Arial"/>
+                <w:szCs w:val="24"/>
+              </w:rPr>
+              <w:t>Lograr al primer año una base inicial de trabajadores verificados, clientes activos y servicios gestionados a través de la plataforma en las comunas priorizadas.​</w:t>
             </w:r>
           </w:p>
           <w:p>
             <w:pPr>
               <w:pStyle w:val="Prrafodelista"/>
-              <w:spacing w:before="240" w:after="240" w:line="240" w:lineRule="auto"/>
-              <w:rPr>
-                <w:iCs/>
-              </w:rPr>
-            </w:pPr>
+              <w:numPr>
+                <w:ilvl w:val="0"/>
+                <w:numId w:val="18"/>
+              </w:numPr>
+              <w:spacing w:after="0"/>
+              <w:rPr>
+                <w:rFonts w:cs="Arial"/>
+                <w:szCs w:val="24"/>
+              </w:rPr>
+            </w:pPr>
+            <w:r>
+              <w:rPr>
+                <w:rFonts w:cs="Arial"/>
+                <w:szCs w:val="24"/>
+              </w:rPr>
+              <w:t>Mantener una experiencia de servicio de alta calidad, buscando una calificación promedio elevada y una tasa alta de servicios completados.​</w:t>
+            </w:r>
+          </w:p>
+          <w:p>
+            <w:pPr>
+              <w:pStyle w:val="Prrafodelista"/>
+              <w:numPr>
+                <w:ilvl w:val="0"/>
+                <w:numId w:val="18"/>
+              </w:numPr>
+              <w:spacing w:after="0"/>
+              <w:rPr>
+                <w:rFonts w:cs="Arial"/>
+                <w:szCs w:val="24"/>
+              </w:rPr>
+            </w:pPr>
+            <w:r>
+              <w:rPr>
+                <w:rFonts w:cs="Arial"/>
+                <w:szCs w:val="24"/>
+              </w:rPr>
+              <w:t>Reducir la gestión manual de coordinación y pagos mediante la automatización de registros, verificaciones, reservas y notificaciones.​</w:t>
+            </w:r>
           </w:p>
           <w:p>
             <w:pPr>
@@ -2632,150 +2771,27 @@
             </w:pPr>
             <w:r>
               <w:rPr>
-                <w:iCs/>
-              </w:rPr>
-              <w:t>Lograr la inscripción de 2.000 clientes en los primeros 15 meses de operación.</w:t>
-            </w:r>
-          </w:p>
-          <w:p>
-            <w:pPr>
-              <w:pStyle w:val="Prrafodelista"/>
-              <w:spacing w:before="240" w:after="240" w:line="240" w:lineRule="auto"/>
-              <w:rPr>
-                <w:iCs/>
-              </w:rPr>
-            </w:pPr>
-          </w:p>
-          <w:p>
-            <w:pPr>
-              <w:pStyle w:val="Prrafodelista"/>
-              <w:numPr>
-                <w:ilvl w:val="0"/>
-                <w:numId w:val="18"/>
-              </w:numPr>
-              <w:spacing w:before="240" w:after="240" w:line="240" w:lineRule="auto"/>
-              <w:rPr>
-                <w:iCs/>
-              </w:rPr>
-            </w:pPr>
-            <w:r>
-              <w:rPr>
-                <w:iCs/>
+                <w:rFonts w:cs="Arial"/>
+                <w:szCs w:val="24"/>
               </w:rPr>
               <w:lastRenderedPageBreak/>
-              <w:t>Conseguir que al menos el 70% de los trabajadores cuenten con verificación de antecedentes y certificaciones en el primer año.</w:t>
-            </w:r>
-          </w:p>
-          <w:p>
-            <w:pPr>
-              <w:pStyle w:val="Prrafodelista"/>
-              <w:spacing w:before="240" w:after="240" w:line="240" w:lineRule="auto"/>
-              <w:rPr>
-                <w:iCs/>
-              </w:rPr>
-            </w:pPr>
-          </w:p>
-          <w:p>
-            <w:pPr>
-              <w:pStyle w:val="Prrafodelista"/>
-              <w:numPr>
-                <w:ilvl w:val="0"/>
-                <w:numId w:val="18"/>
-              </w:numPr>
-              <w:spacing w:before="240" w:after="240" w:line="240" w:lineRule="auto"/>
-              <w:rPr>
-                <w:iCs/>
-              </w:rPr>
-            </w:pPr>
-            <w:r>
-              <w:rPr>
-                <w:iCs/>
-              </w:rPr>
-              <w:t>Incrementar en un 15% la tasa de contratación mensual a lo largo de los 2 primeros años de funcionamiento.</w:t>
-            </w:r>
-          </w:p>
-          <w:p>
-            <w:pPr>
-              <w:pStyle w:val="Prrafodelista"/>
-              <w:spacing w:before="240" w:after="240" w:line="240" w:lineRule="auto"/>
-              <w:rPr>
-                <w:iCs/>
-              </w:rPr>
-            </w:pPr>
-          </w:p>
-          <w:p>
-            <w:pPr>
-              <w:pStyle w:val="Prrafodelista"/>
-              <w:numPr>
-                <w:ilvl w:val="0"/>
-                <w:numId w:val="18"/>
-              </w:numPr>
-              <w:spacing w:before="240" w:after="240" w:line="240" w:lineRule="auto"/>
-              <w:rPr>
-                <w:iCs/>
-              </w:rPr>
-            </w:pPr>
-            <w:r>
-              <w:rPr>
-                <w:iCs/>
-              </w:rPr>
-              <w:t>Conseguir que al menos el 50% de los clientes realicen una calificación del servicio recibido en el transcurso del primer año.</w:t>
-            </w:r>
-          </w:p>
-          <w:p>
-            <w:pPr>
-              <w:pStyle w:val="Prrafodelista"/>
-              <w:spacing w:line="240" w:lineRule="auto"/>
-              <w:rPr>
-                <w:iCs/>
-              </w:rPr>
-            </w:pPr>
-          </w:p>
-          <w:p>
-            <w:pPr>
-              <w:pStyle w:val="Prrafodelista"/>
-              <w:numPr>
-                <w:ilvl w:val="0"/>
-                <w:numId w:val="18"/>
-              </w:numPr>
-              <w:spacing w:before="240" w:after="240" w:line="240" w:lineRule="auto"/>
-              <w:rPr>
-                <w:iCs/>
-              </w:rPr>
-            </w:pPr>
-            <w:r>
-              <w:rPr>
-                <w:iCs/>
-              </w:rPr>
-              <w:t>Incorporar al menos tres nuevas categorías de servicios en la plataforma dentro de los primeros dieciocho meses.</w:t>
-            </w:r>
-          </w:p>
-          <w:p>
-            <w:pPr>
-              <w:pStyle w:val="Prrafodelista"/>
-              <w:spacing w:before="240" w:after="240" w:line="240" w:lineRule="auto"/>
-              <w:rPr>
-                <w:iCs/>
-              </w:rPr>
-            </w:pPr>
-          </w:p>
-          <w:p>
-            <w:pPr>
-              <w:pStyle w:val="Prrafodelista"/>
-              <w:numPr>
-                <w:ilvl w:val="0"/>
-                <w:numId w:val="18"/>
-              </w:numPr>
-              <w:spacing w:before="240" w:after="240" w:line="240" w:lineRule="auto"/>
-              <w:rPr>
-                <w:iCs/>
-              </w:rPr>
-            </w:pPr>
-            <w:r>
-              <w:rPr>
-                <w:iCs/>
-              </w:rPr>
-              <w:t>Alcanzar presencia en al menos 4 regiones del país en los primeros 2 años.</w:t>
+              <w:t xml:space="preserve">Utilizar el módulo de Business </w:t>
+            </w:r>
+            <w:proofErr w:type="spellStart"/>
+            <w:r>
+              <w:rPr>
+                <w:rFonts w:cs="Arial"/>
+                <w:szCs w:val="24"/>
+              </w:rPr>
+              <w:t>Intelligence</w:t>
+            </w:r>
+            <w:proofErr w:type="spellEnd"/>
+            <w:r>
+              <w:rPr>
+                <w:rFonts w:cs="Arial"/>
+                <w:szCs w:val="24"/>
+              </w:rPr>
+              <w:t xml:space="preserve"> para monitorear usuarios, calidad y riesgos, apoyando decisiones de mejora continua y expansión.</w:t>
             </w:r>
           </w:p>
         </w:tc>
@@ -2902,7 +2918,7 @@
               <w:rPr>
                 <w:iCs/>
               </w:rPr>
-              <w:t>Se ha optado por Scrum, dado que facilita el trabajo en ciclos cortos e iterativos, permitiendo entregar avances funcionales en cada sprint y reduciendo los riesgos asociados al desarrollo.</w:t>
+              <w:t xml:space="preserve">Se ha optado por Scrum, dado que facilita el trabajo en ciclos cortos e iterativos, permitiendo entregar avances funcionales en cada sprint y reduciendo los riesgos asociados al desarrollo. </w:t>
             </w:r>
           </w:p>
           <w:p>
@@ -2916,7 +2932,7 @@
               <w:rPr>
                 <w:iCs/>
               </w:rPr>
-              <w:t>A diferencia de metodologías tradicionales como el modelo en cascada, que son más rígidas y demandan definir todos los requisitos al inicio, Scrum posibilita priorizar funcionalidades clave y adaptarlas según la evolución del proyecto. Asimismo, frente a enfoques como Kanban, Scrum ofrece mayor estructura al organizar el trabajo en roles, backlog y entregas incrementales, lo que resulta más adecuado para asegurar valor temprano a los usuarios.</w:t>
+              <w:t xml:space="preserve">A diferencia de metodologías tradicionales como el modelo en cascada, que son más rígidas y demandan definir todos los requisitos al inicio, Scrum posibilita priorizar funcionalidades clave y adaptarlas según la evolución del proyecto. Asimismo, frente a enfoques como Kanban, Scrum ofrece mayor estructura al organizar el trabajo en roles, backlog y entregas incrementales, lo que resulta más adecuado para asegurar valor temprano a los usuarios. </w:t>
             </w:r>
           </w:p>
           <w:p>
@@ -2946,14 +2962,6 @@
               </w:rPr>
               <w:t>, cuyo propósito es crecer y evolucionar en función de las necesidades reales de clientes y trabajadores.</w:t>
             </w:r>
-          </w:p>
-          <w:p>
-            <w:pPr>
-              <w:spacing w:after="240" w:line="240" w:lineRule="auto"/>
-              <w:rPr>
-                <w:iCs/>
-              </w:rPr>
-            </w:pPr>
           </w:p>
         </w:tc>
       </w:tr>
@@ -3352,22 +3360,13 @@
               <w:t xml:space="preserve"> </w:t>
             </w:r>
             <w:hyperlink r:id="rId8" w:history="1">
-              <w:proofErr w:type="gramStart"/>
               <w:r>
                 <w:rPr>
                   <w:rStyle w:val="Hipervnculo"/>
                   <w:iCs/>
                 </w:rPr>
-                <w:t>lin</w:t>
+                <w:t>link</w:t>
               </w:r>
-              <w:r>
-                <w:rPr>
-                  <w:rStyle w:val="Hipervnculo"/>
-                  <w:iCs/>
-                </w:rPr>
-                <w:t>k</w:t>
-              </w:r>
-              <w:proofErr w:type="gramEnd"/>
             </w:hyperlink>
             <w:r>
               <w:rPr>
@@ -3787,50 +3786,10 @@
         <w:ind w:left="-709"/>
         <w:jc w:val="both"/>
       </w:pPr>
-      <w:r>
-        <w:rPr>
-          <w:noProof/>
-        </w:rPr>
-        <w:drawing>
-          <wp:inline distT="0" distB="0" distL="0" distR="0" wp14:anchorId="2C18F2A4" wp14:editId="14105149">
-            <wp:extent cx="6106602" cy="4792505"/>
-            <wp:effectExtent l="0" t="0" r="8890" b="8255"/>
-            <wp:docPr id="1406718041" name="Imagen 1"/>
-            <wp:cNvGraphicFramePr>
-              <a:graphicFrameLocks xmlns:a="http://schemas.openxmlformats.org/drawingml/2006/main" noChangeAspect="1"/>
-            </wp:cNvGraphicFramePr>
-            <a:graphic xmlns:a="http://schemas.openxmlformats.org/drawingml/2006/main">
-              <a:graphicData uri="http://schemas.openxmlformats.org/drawingml/2006/picture">
-                <pic:pic xmlns:pic="http://schemas.openxmlformats.org/drawingml/2006/picture">
-                  <pic:nvPicPr>
-                    <pic:cNvPr id="1406718041" name=""/>
-                    <pic:cNvPicPr/>
-                  </pic:nvPicPr>
-                  <pic:blipFill>
-                    <a:blip r:embed="rId9"/>
-                    <a:stretch>
-                      <a:fillRect/>
-                    </a:stretch>
-                  </pic:blipFill>
-                  <pic:spPr>
-                    <a:xfrm>
-                      <a:off x="0" y="0"/>
-                      <a:ext cx="6119652" cy="4802747"/>
-                    </a:xfrm>
-                    <a:prstGeom prst="rect">
-                      <a:avLst/>
-                    </a:prstGeom>
-                  </pic:spPr>
-                </pic:pic>
-              </a:graphicData>
-            </a:graphic>
-          </wp:inline>
-        </w:drawing>
-      </w:r>
     </w:p>
     <w:sectPr>
-      <w:headerReference w:type="default" r:id="rId10"/>
-      <w:footerReference w:type="default" r:id="rId11"/>
+      <w:headerReference w:type="default" r:id="rId9"/>
+      <w:footerReference w:type="default" r:id="rId10"/>
       <w:pgSz w:w="11906" w:h="16838"/>
       <w:pgMar w:top="1417" w:right="1701" w:bottom="1417" w:left="1701" w:header="708" w:footer="708" w:gutter="0"/>
       <w:pgNumType w:start="1"/>
@@ -4123,6 +4082,119 @@
 <file path=word/numbering.xml><?xml version="1.0" encoding="utf-8"?>
 <w:numbering xmlns:wpc="http://schemas.microsoft.com/office/word/2010/wordprocessingCanvas" xmlns:cx="http://schemas.microsoft.com/office/drawing/2014/chartex" xmlns:cx1="http://schemas.microsoft.com/office/drawing/2015/9/8/chartex" xmlns:cx2="http://schemas.microsoft.com/office/drawing/2015/10/21/chartex" xmlns:cx3="http://schemas.microsoft.com/office/drawing/2016/5/9/chartex" xmlns:cx4="http://schemas.microsoft.com/office/drawing/2016/5/10/chartex" xmlns:cx5="http://schemas.microsoft.com/office/drawing/2016/5/11/chartex" xmlns:cx6="http://schemas.microsoft.com/office/drawing/2016/5/12/chartex" xmlns:cx7="http://schemas.microsoft.com/office/drawing/2016/5/13/chartex" xmlns:cx8="http://schemas.microsoft.com/office/drawing/2016/5/14/chartex" xmlns:mc="http://schemas.openxmlformats.org/markup-compatibility/2006" xmlns:aink="http://schemas.microsoft.com/office/drawing/2016/ink" xmlns:am3d="http://schemas.microsoft.com/office/drawing/2017/model3d" xmlns:o="urn:schemas-microsoft-com:office:office" xmlns:oel="http://schemas.microsoft.com/office/2019/extlst" xmlns:r="http://schemas.openxmlformats.org/officeDocument/2006/relationships" xmlns:m="http://schemas.openxmlformats.org/officeDocument/2006/math" xmlns:v="urn:schemas-microsoft-com:vml" xmlns:wp14="http://schemas.microsoft.com/office/word/2010/wordprocessingDrawing" xmlns:wp="http://schemas.openxmlformats.org/drawingml/2006/wordprocessingDrawing" xmlns:w10="urn:schemas-microsoft-com:office:word" xmlns:w="http://schemas.openxmlformats.org/wordprocessingml/2006/main" xmlns:w14="http://schemas.microsoft.com/office/word/2010/wordml" xmlns:w15="http://schemas.microsoft.com/office/word/2012/wordml" xmlns:w16cex="http://schemas.microsoft.com/office/word/2018/wordml/cex" xmlns:w16cid="http://schemas.microsoft.com/office/word/2016/wordml/cid" xmlns:w16="http://schemas.microsoft.com/office/word/2018/wordml" xmlns:w16du="http://schemas.microsoft.com/office/word/2023/wordml/word16du" xmlns:w16sdtdh="http://schemas.microsoft.com/office/word/2020/wordml/sdtdatahash" xmlns:w16sdtfl="http://schemas.microsoft.com/office/word/2024/wordml/sdtformatlock" xmlns:w16se="http://schemas.microsoft.com/office/word/2015/wordml/symex" xmlns:wpg="http://schemas.microsoft.com/office/word/2010/wordprocessingGroup" xmlns:wpi="http://schemas.microsoft.com/office/word/2010/wordprocessingInk" xmlns:wne="http://schemas.microsoft.com/office/word/2006/wordml" xmlns:wps="http://schemas.microsoft.com/office/word/2010/wordprocessingShape" mc:Ignorable="w14 w15 w16se w16cid w16 w16cex w16sdtdh w16sdtfl w16du wp14">
   <w:abstractNum w:abstractNumId="0" w15:restartNumberingAfterBreak="0">
+    <w:nsid w:val="0BB96547"/>
+    <w:multiLevelType w:val="hybridMultilevel"/>
+    <w:tmpl w:val="F176C23A"/>
+    <w:lvl w:ilvl="0" w:tplc="340A0001">
+      <w:start w:val="1"/>
+      <w:numFmt w:val="bullet"/>
+      <w:lvlText w:val=""/>
+      <w:lvlJc w:val="left"/>
+      <w:pPr>
+        <w:ind w:left="750" w:hanging="360"/>
+      </w:pPr>
+      <w:rPr>
+        <w:rFonts w:ascii="Symbol" w:hAnsi="Symbol" w:hint="default"/>
+      </w:rPr>
+    </w:lvl>
+    <w:lvl w:ilvl="1" w:tplc="FFFFFFFF" w:tentative="1">
+      <w:start w:val="1"/>
+      <w:numFmt w:val="bullet"/>
+      <w:lvlText w:val="o"/>
+      <w:lvlJc w:val="left"/>
+      <w:pPr>
+        <w:ind w:left="1470" w:hanging="360"/>
+      </w:pPr>
+      <w:rPr>
+        <w:rFonts w:ascii="Courier New" w:hAnsi="Courier New" w:cs="Courier New" w:hint="default"/>
+      </w:rPr>
+    </w:lvl>
+    <w:lvl w:ilvl="2" w:tplc="FFFFFFFF" w:tentative="1">
+      <w:start w:val="1"/>
+      <w:numFmt w:val="bullet"/>
+      <w:lvlText w:val=""/>
+      <w:lvlJc w:val="left"/>
+      <w:pPr>
+        <w:ind w:left="2190" w:hanging="360"/>
+      </w:pPr>
+      <w:rPr>
+        <w:rFonts w:ascii="Wingdings" w:hAnsi="Wingdings" w:hint="default"/>
+      </w:rPr>
+    </w:lvl>
+    <w:lvl w:ilvl="3" w:tplc="FFFFFFFF" w:tentative="1">
+      <w:start w:val="1"/>
+      <w:numFmt w:val="bullet"/>
+      <w:lvlText w:val=""/>
+      <w:lvlJc w:val="left"/>
+      <w:pPr>
+        <w:ind w:left="2910" w:hanging="360"/>
+      </w:pPr>
+      <w:rPr>
+        <w:rFonts w:ascii="Symbol" w:hAnsi="Symbol" w:hint="default"/>
+      </w:rPr>
+    </w:lvl>
+    <w:lvl w:ilvl="4" w:tplc="FFFFFFFF" w:tentative="1">
+      <w:start w:val="1"/>
+      <w:numFmt w:val="bullet"/>
+      <w:lvlText w:val="o"/>
+      <w:lvlJc w:val="left"/>
+      <w:pPr>
+        <w:ind w:left="3630" w:hanging="360"/>
+      </w:pPr>
+      <w:rPr>
+        <w:rFonts w:ascii="Courier New" w:hAnsi="Courier New" w:cs="Courier New" w:hint="default"/>
+      </w:rPr>
+    </w:lvl>
+    <w:lvl w:ilvl="5" w:tplc="FFFFFFFF" w:tentative="1">
+      <w:start w:val="1"/>
+      <w:numFmt w:val="bullet"/>
+      <w:lvlText w:val=""/>
+      <w:lvlJc w:val="left"/>
+      <w:pPr>
+        <w:ind w:left="4350" w:hanging="360"/>
+      </w:pPr>
+      <w:rPr>
+        <w:rFonts w:ascii="Wingdings" w:hAnsi="Wingdings" w:hint="default"/>
+      </w:rPr>
+    </w:lvl>
+    <w:lvl w:ilvl="6" w:tplc="FFFFFFFF" w:tentative="1">
+      <w:start w:val="1"/>
+      <w:numFmt w:val="bullet"/>
+      <w:lvlText w:val=""/>
+      <w:lvlJc w:val="left"/>
+      <w:pPr>
+        <w:ind w:left="5070" w:hanging="360"/>
+      </w:pPr>
+      <w:rPr>
+        <w:rFonts w:ascii="Symbol" w:hAnsi="Symbol" w:hint="default"/>
+      </w:rPr>
+    </w:lvl>
+    <w:lvl w:ilvl="7" w:tplc="FFFFFFFF" w:tentative="1">
+      <w:start w:val="1"/>
+      <w:numFmt w:val="bullet"/>
+      <w:lvlText w:val="o"/>
+      <w:lvlJc w:val="left"/>
+      <w:pPr>
+        <w:ind w:left="5790" w:hanging="360"/>
+      </w:pPr>
+      <w:rPr>
+        <w:rFonts w:ascii="Courier New" w:hAnsi="Courier New" w:cs="Courier New" w:hint="default"/>
+      </w:rPr>
+    </w:lvl>
+    <w:lvl w:ilvl="8" w:tplc="FFFFFFFF" w:tentative="1">
+      <w:start w:val="1"/>
+      <w:numFmt w:val="bullet"/>
+      <w:lvlText w:val=""/>
+      <w:lvlJc w:val="left"/>
+      <w:pPr>
+        <w:ind w:left="6510" w:hanging="360"/>
+      </w:pPr>
+      <w:rPr>
+        <w:rFonts w:ascii="Wingdings" w:hAnsi="Wingdings" w:hint="default"/>
+      </w:rPr>
+    </w:lvl>
+  </w:abstractNum>
+  <w:abstractNum w:abstractNumId="1" w15:restartNumberingAfterBreak="0">
     <w:nsid w:val="2B7979CA"/>
     <w:multiLevelType w:val="multilevel"/>
     <w:tmpl w:val="04D606B0"/>
@@ -4211,7 +4283,7 @@
       </w:pPr>
     </w:lvl>
   </w:abstractNum>
-  <w:abstractNum w:abstractNumId="1" w15:restartNumberingAfterBreak="0">
+  <w:abstractNum w:abstractNumId="2" w15:restartNumberingAfterBreak="0">
     <w:nsid w:val="2DE310FA"/>
     <w:multiLevelType w:val="multilevel"/>
     <w:tmpl w:val="F8AC607E"/>
@@ -4324,7 +4396,7 @@
       </w:rPr>
     </w:lvl>
   </w:abstractNum>
-  <w:abstractNum w:abstractNumId="2" w15:restartNumberingAfterBreak="0">
+  <w:abstractNum w:abstractNumId="3" w15:restartNumberingAfterBreak="0">
     <w:nsid w:val="2F737972"/>
     <w:multiLevelType w:val="multilevel"/>
     <w:tmpl w:val="E9422FF2"/>
@@ -4437,7 +4509,7 @@
       </w:rPr>
     </w:lvl>
   </w:abstractNum>
-  <w:abstractNum w:abstractNumId="3" w15:restartNumberingAfterBreak="0">
+  <w:abstractNum w:abstractNumId="4" w15:restartNumberingAfterBreak="0">
     <w:nsid w:val="352A5CA9"/>
     <w:multiLevelType w:val="hybridMultilevel"/>
     <w:tmpl w:val="F05E0C8A"/>
@@ -4523,7 +4595,7 @@
       </w:pPr>
     </w:lvl>
   </w:abstractNum>
-  <w:abstractNum w:abstractNumId="4" w15:restartNumberingAfterBreak="0">
+  <w:abstractNum w:abstractNumId="5" w15:restartNumberingAfterBreak="0">
     <w:nsid w:val="37EE5CEC"/>
     <w:multiLevelType w:val="multilevel"/>
     <w:tmpl w:val="3BB88520"/>
@@ -4636,7 +4708,7 @@
       </w:rPr>
     </w:lvl>
   </w:abstractNum>
-  <w:abstractNum w:abstractNumId="5" w15:restartNumberingAfterBreak="0">
+  <w:abstractNum w:abstractNumId="6" w15:restartNumberingAfterBreak="0">
     <w:nsid w:val="4D12776D"/>
     <w:multiLevelType w:val="multilevel"/>
     <w:tmpl w:val="AEC2F1CA"/>
@@ -4753,7 +4825,7 @@
       </w:pPr>
     </w:lvl>
   </w:abstractNum>
-  <w:abstractNum w:abstractNumId="6" w15:restartNumberingAfterBreak="0">
+  <w:abstractNum w:abstractNumId="7" w15:restartNumberingAfterBreak="0">
     <w:nsid w:val="59572963"/>
     <w:multiLevelType w:val="multilevel"/>
     <w:tmpl w:val="F27E5F28"/>
@@ -4866,7 +4938,7 @@
       </w:pPr>
     </w:lvl>
   </w:abstractNum>
-  <w:abstractNum w:abstractNumId="7" w15:restartNumberingAfterBreak="0">
+  <w:abstractNum w:abstractNumId="8" w15:restartNumberingAfterBreak="0">
     <w:nsid w:val="60C0622D"/>
     <w:multiLevelType w:val="multilevel"/>
     <w:tmpl w:val="37BC84C2"/>
@@ -4979,7 +5051,7 @@
       </w:rPr>
     </w:lvl>
   </w:abstractNum>
-  <w:abstractNum w:abstractNumId="8" w15:restartNumberingAfterBreak="0">
+  <w:abstractNum w:abstractNumId="9" w15:restartNumberingAfterBreak="0">
     <w:nsid w:val="6B4B775C"/>
     <w:multiLevelType w:val="multilevel"/>
     <w:tmpl w:val="8CF4EBFE"/>
@@ -5093,31 +5165,31 @@
     </w:lvl>
   </w:abstractNum>
   <w:num w:numId="1" w16cid:durableId="1357779781">
+    <w:abstractNumId w:val="3"/>
+  </w:num>
+  <w:num w:numId="2" w16cid:durableId="445470898">
+    <w:abstractNumId w:val="5"/>
+  </w:num>
+  <w:num w:numId="3" w16cid:durableId="1750228256">
+    <w:abstractNumId w:val="1"/>
+  </w:num>
+  <w:num w:numId="4" w16cid:durableId="1338075486">
     <w:abstractNumId w:val="2"/>
   </w:num>
-  <w:num w:numId="2" w16cid:durableId="445470898">
-    <w:abstractNumId w:val="4"/>
+  <w:num w:numId="5" w16cid:durableId="383794795">
+    <w:abstractNumId w:val="9"/>
   </w:num>
-  <w:num w:numId="3" w16cid:durableId="1750228256">
-    <w:abstractNumId w:val="0"/>
-  </w:num>
-  <w:num w:numId="4" w16cid:durableId="1338075486">
-    <w:abstractNumId w:val="1"/>
-  </w:num>
-  <w:num w:numId="5" w16cid:durableId="383794795">
+  <w:num w:numId="6" w16cid:durableId="1519738432">
     <w:abstractNumId w:val="8"/>
   </w:num>
-  <w:num w:numId="6" w16cid:durableId="1519738432">
+  <w:num w:numId="7" w16cid:durableId="44643867">
     <w:abstractNumId w:val="7"/>
   </w:num>
-  <w:num w:numId="7" w16cid:durableId="44643867">
+  <w:num w:numId="8" w16cid:durableId="958297235">
     <w:abstractNumId w:val="6"/>
   </w:num>
-  <w:num w:numId="8" w16cid:durableId="958297235">
-    <w:abstractNumId w:val="5"/>
-  </w:num>
   <w:num w:numId="9" w16cid:durableId="1568565182">
-    <w:abstractNumId w:val="5"/>
+    <w:abstractNumId w:val="6"/>
     <w:lvlOverride w:ilvl="1">
       <w:lvl w:ilvl="1">
         <w:numFmt w:val="bullet"/>
@@ -5137,7 +5209,7 @@
     </w:lvlOverride>
   </w:num>
   <w:num w:numId="10" w16cid:durableId="537351704">
-    <w:abstractNumId w:val="5"/>
+    <w:abstractNumId w:val="6"/>
     <w:lvlOverride w:ilvl="1">
       <w:lvl w:ilvl="1">
         <w:numFmt w:val="bullet"/>
@@ -5157,7 +5229,7 @@
     </w:lvlOverride>
   </w:num>
   <w:num w:numId="11" w16cid:durableId="2094818620">
-    <w:abstractNumId w:val="5"/>
+    <w:abstractNumId w:val="6"/>
     <w:lvlOverride w:ilvl="1">
       <w:lvl w:ilvl="1">
         <w:numFmt w:val="bullet"/>
@@ -5177,7 +5249,7 @@
     </w:lvlOverride>
   </w:num>
   <w:num w:numId="12" w16cid:durableId="1762529958">
-    <w:abstractNumId w:val="5"/>
+    <w:abstractNumId w:val="6"/>
     <w:lvlOverride w:ilvl="1">
       <w:lvl w:ilvl="1">
         <w:numFmt w:val="bullet"/>
@@ -5197,7 +5269,7 @@
     </w:lvlOverride>
   </w:num>
   <w:num w:numId="13" w16cid:durableId="773601013">
-    <w:abstractNumId w:val="5"/>
+    <w:abstractNumId w:val="6"/>
     <w:lvlOverride w:ilvl="1">
       <w:lvl w:ilvl="1">
         <w:numFmt w:val="bullet"/>
@@ -5217,7 +5289,7 @@
     </w:lvlOverride>
   </w:num>
   <w:num w:numId="14" w16cid:durableId="1435974215">
-    <w:abstractNumId w:val="5"/>
+    <w:abstractNumId w:val="6"/>
     <w:lvlOverride w:ilvl="1">
       <w:lvl w:ilvl="1">
         <w:numFmt w:val="bullet"/>
@@ -5237,7 +5309,7 @@
     </w:lvlOverride>
   </w:num>
   <w:num w:numId="15" w16cid:durableId="2056930123">
-    <w:abstractNumId w:val="5"/>
+    <w:abstractNumId w:val="6"/>
     <w:lvlOverride w:ilvl="1">
       <w:lvl w:ilvl="1">
         <w:numFmt w:val="bullet"/>
@@ -5257,7 +5329,7 @@
     </w:lvlOverride>
   </w:num>
   <w:num w:numId="16" w16cid:durableId="480658494">
-    <w:abstractNumId w:val="5"/>
+    <w:abstractNumId w:val="6"/>
     <w:lvlOverride w:ilvl="1">
       <w:lvl w:ilvl="1">
         <w:numFmt w:val="bullet"/>
@@ -5277,7 +5349,7 @@
     </w:lvlOverride>
   </w:num>
   <w:num w:numId="17" w16cid:durableId="845242672">
-    <w:abstractNumId w:val="5"/>
+    <w:abstractNumId w:val="6"/>
     <w:lvlOverride w:ilvl="1">
       <w:lvl w:ilvl="1">
         <w:numFmt w:val="bullet"/>
@@ -5297,7 +5369,10 @@
     </w:lvlOverride>
   </w:num>
   <w:num w:numId="18" w16cid:durableId="886257134">
-    <w:abstractNumId w:val="3"/>
+    <w:abstractNumId w:val="4"/>
+  </w:num>
+  <w:num w:numId="19" w16cid:durableId="651132051">
+    <w:abstractNumId w:val="0"/>
   </w:num>
 </w:numbering>
 </file>
@@ -5821,7 +5896,6 @@
   <w:style w:type="character" w:default="1" w:styleId="Fuentedeprrafopredeter">
     <w:name w:val="Default Paragraph Font"/>
     <w:uiPriority w:val="1"/>
-    <w:semiHidden/>
     <w:unhideWhenUsed/>
   </w:style>
   <w:style w:type="table" w:default="1" w:styleId="Tablanormal">

</xml_diff>